<commit_message>
Harden live proof gates and grant evidence pipeline
</commit_message>
<xml_diff>
--- a/grant_submissions/DICE_HR001126S0010/LumenCore_DICE_Abstract_WORKING_DRAFT.docx
+++ b/grant_submissions/DICE_HR001126S0010/LumenCore_DICE_Abstract_WORKING_DRAFT.docx
@@ -508,7 +508,7 @@
                 <w:color w:val="000000"/>
                 <w:sz w:val="20"/>
               </w:rPr>
-              <w:t>$4,920,000 planning estimate; cost basis requires validation before submission</w:t>
+              <w:t>$4,920,000 abstract-stage ROM planning estimate; validate before full proposal</w:t>
             </w:r>
           </w:p>
         </w:tc>
@@ -692,7 +692,8 @@
     </w:p>
     <w:p>
       <w:pPr>
-        <w:pStyle w:val="Heading1"/>
+        <w:keepNext/>
+        <w:spacing w:before="240" w:after="120"/>
       </w:pPr>
       <w:r>
         <w:rPr>
@@ -802,7 +803,8 @@
     </w:p>
     <w:p>
       <w:pPr>
-        <w:pStyle w:val="Heading1"/>
+        <w:keepNext/>
+        <w:spacing w:before="240" w:after="120"/>
       </w:pPr>
       <w:r>
         <w:rPr>
@@ -828,7 +830,7 @@
           <w:color w:val="000000"/>
           <w:sz w:val="24"/>
         </w:rPr>
-        <w:t>LumenCore proposes Coherence-Bounded Peer Mesh (CBPM), a local adaptor architecture for heterogeneous open-weight and black-box AI agents. CBPM replaces a persistent central orchestrator with sparse peer task markets, reputation-weighted context fusion, and a local inference-control loop that exposes measurable role-coherence guarantees to the coordination layer. The research addresses TA1 and TA2 together because planning depth is limited by the period over which each agent can remain aligned to its assigned role.</w:t>
+        <w:t>LumenCore proposes Coherence-Bounded Peer Mesh (CBPM), a local adaptor architecture for heterogeneous open-weight and black-box AI agents. CBPM replaces a persistent central orchestrator with sparse peer task markets, reputation-weighted context fusion, and a local inference-control loop that exposes measurable role-coherence bounds to the coordination layer. The research addresses TA1 and TA2 together because planning depth is limited by the period over which each agent can remain aligned to its assigned role.</w:t>
       </w:r>
     </w:p>
     <w:p>
@@ -881,7 +883,8 @@
     </w:p>
     <w:p>
       <w:pPr>
-        <w:pStyle w:val="Heading1"/>
+        <w:keepNext/>
+        <w:spacing w:before="240" w:after="120"/>
       </w:pPr>
       <w:r>
         <w:rPr>
@@ -896,7 +899,8 @@
     </w:p>
     <w:p>
       <w:pPr>
-        <w:pStyle w:val="Heading2"/>
+        <w:keepNext/>
+        <w:spacing w:before="160" w:after="80"/>
       </w:pPr>
       <w:r>
         <w:rPr>
@@ -943,7 +947,8 @@
     </w:p>
     <w:p>
       <w:pPr>
-        <w:pStyle w:val="Heading2"/>
+        <w:keepNext/>
+        <w:spacing w:before="160" w:after="80"/>
       </w:pPr>
       <w:r>
         <w:rPr>
@@ -1034,7 +1039,8 @@
     </w:p>
     <w:p>
       <w:pPr>
-        <w:pStyle w:val="Heading2"/>
+        <w:keepNext/>
+        <w:spacing w:before="160" w:after="80"/>
       </w:pPr>
       <w:r>
         <w:rPr>
@@ -1125,7 +1131,8 @@
     </w:p>
     <w:p>
       <w:pPr>
-        <w:pStyle w:val="Heading2"/>
+        <w:keepNext/>
+        <w:spacing w:before="160" w:after="80"/>
       </w:pPr>
       <w:r>
         <w:rPr>
@@ -1178,27 +1185,44 @@
       <w:r>
         <w:rPr>
           <w:rFonts w:ascii="Times New Roman" w:hAnsi="Times New Roman"/>
-          <w:b/>
+          <w:b w:val="0"/>
           <w:i w:val="0"/>
           <w:color w:val="000000"/>
           <w:sz w:val="24"/>
         </w:rPr>
-        <w:t>Evidence boundary:</w:t>
-      </w:r>
-      <w:r>
-        <w:rPr>
-          <w:rFonts w:ascii="Times New Roman" w:hAnsi="Times New Roman"/>
-          <w:b w:val="0"/>
+        <w:t>A disjoint constraint-contract ablation then compared peer reputation with bids carrying explicit role, horizon, evidence-lineage, expiration, and risk fields. Across 30 validation scenarios per condition with 500 agents and 1,200 tasks, the contract method improved safe completion by 4.16 percentage points in benign conditions (95% paired bootstrap CI 3.84-4.46), 3.52 points under 10% independent compromise (3.04-3.98), 3.50 points under 10% collusion (3.05-3.96), 2.10 points under monitor shift (1.69-2.49), and 1.35 points under 25% high collusion (0.95-1.75). Modeled constraint violations fell by 5.66-7.24 points and messages per safe completion fell by 1.07-1.81. The tradeoff was a 2.5-4.5 point reduction in raw completion from deterministic rejection, with false rejection reaching 11.38% under monitor shift. Under high collusion, compromised assignments increased by 0.96 points because locally consistent forgeries passed field checks. Contract fields were piggybacked on existing messages; byte, latency, and cryptographic costs were not measured.</w:t>
+      </w:r>
+    </w:p>
+    <w:p>
+      <w:pPr>
+        <w:spacing w:after="120" w:line="240" w:lineRule="auto"/>
+        <w:jc w:val="left"/>
+      </w:pPr>
+      <w:r>
+        <w:rPr>
+          <w:rFonts w:ascii="Times New Roman" w:hAnsi="Times New Roman"/>
+          <w:b/>
           <w:i w:val="0"/>
           <w:color w:val="000000"/>
           <w:sz w:val="24"/>
         </w:rPr>
+        <w:t>Evidence boundary:</w:t>
+      </w:r>
+      <w:r>
+        <w:rPr>
+          <w:rFonts w:ascii="Times New Roman" w:hAnsi="Times New Roman"/>
+          <w:b w:val="0"/>
+          <w:i w:val="0"/>
+          <w:color w:val="000000"/>
+          <w:sz w:val="24"/>
+        </w:rPr>
         <w:t xml:space="preserve"> these agents are stochastic task executors, not language models. The result demonstrates only that the proposed metrics and a narrow protocol hypothesis can be evaluated reproducibly. It does not establish DICE program metric attainment, foundation-model inference at these scales, operational performance, or adversarial security. Inputs, source commit, trial CSVs, scorecards, and SHA-256 manifests are retained for audit.</w:t>
       </w:r>
     </w:p>
     <w:p>
       <w:pPr>
-        <w:pStyle w:val="Heading2"/>
+        <w:keepNext/>
+        <w:spacing w:before="160" w:after="80"/>
       </w:pPr>
       <w:r>
         <w:rPr>
@@ -1289,7 +1313,8 @@
     </w:p>
     <w:p>
       <w:pPr>
-        <w:pStyle w:val="Heading2"/>
+        <w:keepNext/>
+        <w:spacing w:before="160" w:after="80"/>
       </w:pPr>
       <w:r>
         <w:rPr>
@@ -1315,7 +1340,7 @@
           <w:color w:val="000000"/>
           <w:sz w:val="24"/>
         </w:rPr>
-        <w:t>Existing software capabilities include a Python/FastAPI human-approval hub, centralized multi-engine orchestration, fail-closed runtime controls, streaming anomaly detection, walk-forward benchmarking, and SHA-256 evidence manifests. A public demonstration and evidence portal is available at https://lumen-core.ai and the public repository is https://github.com/robertashworth1986-debug/lumen-core-public. Public code is MIT licensed; proposal-specific adaptor research and data-rights assertions will be identified in the full proposal.</w:t>
+        <w:t>Existing software capabilities include a Python/FastAPI human-approval hub, centralized multi-engine orchestration, fail-closed runtime controls, streaming anomaly detection, walk-forward benchmarking, and SHA-256 evidence manifests. A public demonstration and evidence portal is available at https://lumen-core.ai and the public repository is available at https://github.com/robertashworth1986-debug/lumen-core-public with MIT-licensed public code; proposal-specific adaptor research and data-rights assertions will be identified in the full proposal.</w:t>
       </w:r>
     </w:p>
     <w:p>
@@ -1336,7 +1361,8 @@
     </w:p>
     <w:p>
       <w:pPr>
-        <w:pStyle w:val="Heading1"/>
+        <w:keepNext/>
+        <w:spacing w:before="240" w:after="120"/>
       </w:pPr>
       <w:r>
         <w:rPr>
@@ -1399,7 +1425,8 @@
     </w:p>
     <w:p>
       <w:pPr>
-        <w:pStyle w:val="Heading1"/>
+        <w:keepNext/>
+        <w:spacing w:before="240" w:after="120"/>
       </w:pPr>
       <w:r>
         <w:rPr>
@@ -1425,7 +1452,7 @@
           <w:color w:val="000000"/>
           <w:sz w:val="24"/>
         </w:rPr>
-        <w:t>The following is a planning estimate for abstract review, not a certified cost proposal. The provisional basis is 21,060 direct labor hours at a $100/hour blended direct rate, 25% fringe, 28% combined overhead/G&amp;A on labor plus fringe, $350,000 of specialized subaward/consultant effort, $1,040,000 of cloud/HPC, $80,000 of travel, and $80,000 of software/data/equipment. Rates, indirect costs, subaward scopes, resource-sharing terms, and vendor quotations must be validated before submission.</w:t>
+        <w:t>The following is an abstract-stage ROM planning estimate, not a certified cost proposal or reviewed cost volume. The provisional basis is 21,060 direct labor hours at a $100/hour blended direct rate, 25% fringe, 28% combined overhead/G&amp;A on labor plus fringe, $350,000 of specialized subaward/consultant effort, $1,040,000 of cloud/HPC, $80,000 of travel, and $80,000 of software/data/equipment. Rates, indirect costs, subaward scopes, resource-sharing terms, and vendor quotations must be validated before any full-proposal cost submission.</w:t>
       </w:r>
     </w:p>
     <w:tbl>
@@ -2174,17 +2201,13 @@
           <w:color w:val="000000"/>
           <w:sz w:val="24"/>
         </w:rPr>
-        <w:t>Major milestones: Month 3 adaptor interface prototype; Month 4 self-evaluation; Month 6 centralized baseline integration; Month 8 Phase 1 comparison; Months 13/16/19 adversarial evaluations; Month 23 down-select playoff; Month 30 scaling evaluation; Month 33 self-play; Month 35 final competition and transition demo.</w:t>
-      </w:r>
-    </w:p>
-    <w:p>
-      <w:r>
-        <w:br w:type="page"/>
-      </w:r>
-    </w:p>
-    <w:p>
-      <w:pPr>
-        <w:pStyle w:val="Heading1"/>
+        <w:t>Major milestones: M3 adaptor prototype; M4 self-evaluation; M6 baseline integration; M8 Phase 1 comparison; M13/16/19 adversarial evaluations; M23 down-select; M30 scaling evaluation; M33 self-play; M35 transition demo.</w:t>
+      </w:r>
+    </w:p>
+    <w:p>
+      <w:pPr>
+        <w:keepNext/>
+        <w:spacing w:before="240" w:after="120"/>
       </w:pPr>
       <w:r>
         <w:rPr>
@@ -2232,7 +2255,7 @@
           <w:color w:val="000000"/>
           <w:sz w:val="24"/>
         </w:rPr>
-        <w:t>Ashworth, Robert. "HarborSentinel Synthetic Benchmark: Explainable Streaming Maritime Anomaly Detection." Technical report and reproducibility package, 2026.</w:t>
+        <w:t>Ashworth, Robert. "DICE Constraint-Carrying Commitment Benchmark: Role, Evidence-Lineage, Expiration, and Coherence-Horizon Ablation." Generated discrete-event technical report and SHA-256 manifest, 2026.</w:t>
       </w:r>
     </w:p>
     <w:p>
@@ -2251,7 +2274,7 @@
           <w:color w:val="000000"/>
           <w:sz w:val="24"/>
         </w:rPr>
-        <w:t>Ashworth, Robert. "Harmonic Validation Protocol: Leakage-Resistant Walk-Forward Evidence and Frozen Delta Requirements." Technical report, 2026.</w:t>
+        <w:t>Ashworth, Robert. "HarborSentinel Synthetic Benchmark: Explainable Streaming Maritime Anomaly Detection." Technical report and reproducibility package, 2026.</w:t>
       </w:r>
     </w:p>
     <w:p>
@@ -2270,7 +2293,7 @@
           <w:color w:val="000000"/>
           <w:sz w:val="24"/>
         </w:rPr>
-        <w:t>Ashworth, Robert. "LumenCore Platform, Proof, and Commercialization Map." Technical report, 2026.</w:t>
+        <w:t>Ashworth, Robert. "Harmonic Validation Protocol: Leakage-Resistant Walk-Forward Evidence and Frozen Delta Requirements." Technical report, 2026.</w:t>
       </w:r>
     </w:p>
     <w:p>
@@ -2289,22 +2312,7 @@
           <w:color w:val="000000"/>
           <w:sz w:val="24"/>
         </w:rPr>
-        <w:t>Ashworth, Robert. "Luma Production Context: Evidence-Calibrated Multi-Horizon Decision Platform." Technical report, 2026.</w:t>
-      </w:r>
-    </w:p>
-    <w:p>
-      <w:pPr>
-        <w:pStyle w:val="Heading1"/>
-      </w:pPr>
-      <w:r>
-        <w:rPr>
-          <w:rFonts w:ascii="Times New Roman" w:hAnsi="Times New Roman"/>
-          <w:b/>
-          <w:i w:val="0"/>
-          <w:color w:val="1F4E78"/>
-          <w:sz w:val="28"/>
-        </w:rPr>
-        <w:t>6. Bibliography</w:t>
+        <w:t>Ashworth, Robert. "LumenCore Platform, Proof, and Commercialization Map." Technical report, 2026.</w:t>
       </w:r>
     </w:p>
     <w:p>
@@ -2323,7 +2331,23 @@
           <w:color w:val="000000"/>
           <w:sz w:val="24"/>
         </w:rPr>
-        <w:t>DARPA. HR001126S0010, Decentralized Artificial Intelligence through Controlled Emergence (DICE), 2026. https://www.darpa.mil/research/programs/decentralized-artificial-intelligence-through-controlled-emergence</w:t>
+        <w:t>Ashworth, Robert. "Luma Production Context: Evidence-Calibrated Multi-Horizon Decision Platform." Technical report, 2026.</w:t>
+      </w:r>
+    </w:p>
+    <w:p>
+      <w:pPr>
+        <w:keepNext/>
+        <w:spacing w:before="240" w:after="120"/>
+      </w:pPr>
+      <w:r>
+        <w:rPr>
+          <w:rFonts w:ascii="Times New Roman" w:hAnsi="Times New Roman"/>
+          <w:b/>
+          <w:i w:val="0"/>
+          <w:color w:val="1F4E78"/>
+          <w:sz w:val="28"/>
+        </w:rPr>
+        <w:t>6. Bibliography</w:t>
       </w:r>
     </w:p>
     <w:p>
@@ -2342,7 +2366,7 @@
           <w:color w:val="000000"/>
           <w:sz w:val="24"/>
         </w:rPr>
-        <w:t>Turner, A. M., et al. "Steering Language Models with Activation Engineering." arXiv:2308.10248, 2023. https://arxiv.org/abs/2308.10248</w:t>
+        <w:t>Defense Advanced Research Projects Agency. (2026). HR001126S0010, Decentralized Artificial Intelligence through Controlled Emergence (DICE). https://www.darpa.mil/research/programs/decentralized-artificial-intelligence-through-controlled-emergence</w:t>
       </w:r>
     </w:p>
     <w:p>
@@ -2361,7 +2385,7 @@
           <w:color w:val="000000"/>
           <w:sz w:val="24"/>
         </w:rPr>
-        <w:t>Shapira, N., et al. "Prompt Infection: LLM-to-LLM Prompt Injection within Multi-Agent Systems." arXiv:2410.07283, 2024. https://arxiv.org/abs/2410.07283</w:t>
+        <w:t>Turner, A. M., et al. (2023). Steering Language Models with Activation Engineering. arXiv:2308.10248. https://arxiv.org/abs/2308.10248</w:t>
       </w:r>
     </w:p>
     <w:p>
@@ -2380,7 +2404,7 @@
           <w:color w:val="000000"/>
           <w:sz w:val="24"/>
         </w:rPr>
-        <w:t>Friston, K. J., et al. "Designing Ecosystems of Intelligence from First Principles." Collective Intelligence 3(1), 2024.</w:t>
+        <w:t>Shapira, N., et al. (2024). Prompt Infection: LLM-to-LLM Prompt Injection within Multi-Agent Systems. arXiv:2410.07283. https://arxiv.org/abs/2410.07283</w:t>
       </w:r>
     </w:p>
     <w:p>
@@ -2399,7 +2423,7 @@
           <w:color w:val="000000"/>
           <w:sz w:val="24"/>
         </w:rPr>
-        <w:t>Zhou, H., et al. "ReSo: A Reward-Driven Self-Organizing LLM-Based Multi-Agent System for Reasoning Tasks." EMNLP, 2025.</w:t>
+        <w:t>Friston, K. J., et al. (2024). Designing Ecosystems of Intelligence from First Principles. Collective Intelligence, 3(1). https://doi.org/10.1177/26339137231222481</w:t>
       </w:r>
     </w:p>
     <w:p>
@@ -2418,7 +2442,7 @@
           <w:color w:val="000000"/>
           <w:sz w:val="24"/>
         </w:rPr>
-        <w:t>Lee, H., et al. "Robust Multi-Agent LLMs under Byzantine Faults." arXiv:2605.09076, 2026. https://arxiv.org/abs/2605.09076</w:t>
+        <w:t>Zhou, H., et al. (2025). ReSo: A Reward-Driven Self-Organizing LLM-Based Multi-Agent System for Reasoning Tasks. Proceedings of EMNLP 2025. https://aclanthology.org/2025.emnlp-main.808/</w:t>
       </w:r>
     </w:p>
     <w:p>
@@ -2437,7 +2461,7 @@
           <w:color w:val="000000"/>
           <w:sz w:val="24"/>
         </w:rPr>
-        <w:t>Model Context Protocol. https://github.com/modelcontextprotocol</w:t>
+        <w:t>Lee, H., et al. (2026). Robust Multi-Agent LLMs under Byzantine Faults. arXiv:2605.09076. https://arxiv.org/abs/2605.09076</w:t>
       </w:r>
     </w:p>
     <w:p>
@@ -2456,7 +2480,7 @@
           <w:color w:val="000000"/>
           <w:sz w:val="24"/>
         </w:rPr>
-        <w:t>Agent2Agent Protocol. https://github.com/a2aproject</w:t>
+        <w:t>Model Context Protocol project. (2026). Open protocol repository. https://github.com/modelcontextprotocol</w:t>
       </w:r>
     </w:p>
     <w:p>
@@ -2475,7 +2499,7 @@
           <w:color w:val="000000"/>
           <w:sz w:val="24"/>
         </w:rPr>
-        <w:t>vLLM Project. https://docs.vllm.ai/</w:t>
+        <w:t>Agent2Agent Protocol project. (2026). Open protocol repository. https://github.com/a2aproject</w:t>
       </w:r>
     </w:p>
     <w:p>
@@ -2494,7 +2518,26 @@
           <w:color w:val="000000"/>
           <w:sz w:val="24"/>
         </w:rPr>
-        <w:t>Fujimoto, R. M. "Parallel Discrete Event Simulation." Communications of the ACM 33(10), 1990.</w:t>
+        <w:t>vLLM project. (2026). vLLM documentation. https://docs.vllm.ai/</w:t>
+      </w:r>
+    </w:p>
+    <w:p>
+      <w:pPr>
+        <w:numPr>
+          <w:ilvl w:val="0"/>
+          <w:numId w:val="13"/>
+        </w:numPr>
+        <w:spacing w:after="60" w:line="240" w:lineRule="auto"/>
+      </w:pPr>
+      <w:r>
+        <w:rPr>
+          <w:rFonts w:ascii="Times New Roman" w:hAnsi="Times New Roman"/>
+          <w:b w:val="0"/>
+          <w:i w:val="0"/>
+          <w:color w:val="000000"/>
+          <w:sz w:val="24"/>
+        </w:rPr>
+        <w:t>Fujimoto, R. M. (1990). Parallel Discrete Event Simulation. Communications of the ACM, 33(10), 30-53. https://doi.org/10.1145/84537.84545</w:t>
       </w:r>
     </w:p>
     <w:sectPr>
@@ -2506,45 +2549,6 @@
     </w:sectPr>
   </w:body>
 </w:document>
-</file>
-
-<file path=word/comments.xml><?xml version="1.0" encoding="utf-8"?>
-<w:comments xmlns:wpc="http://schemas.microsoft.com/office/word/2010/wordprocessingCanvas" xmlns:cx="http://schemas.microsoft.com/office/drawing/2014/chartex" xmlns:cx1="http://schemas.microsoft.com/office/drawing/2015/9/8/chartex" xmlns:cx2="http://schemas.microsoft.com/office/drawing/2015/10/21/chartex" xmlns:cx3="http://schemas.microsoft.com/office/drawing/2016/5/9/chartex" xmlns:cx4="http://schemas.microsoft.com/office/drawing/2016/5/10/chartex" xmlns:cx5="http://schemas.microsoft.com/office/drawing/2016/5/11/chartex" xmlns:cx6="http://schemas.microsoft.com/office/drawing/2016/5/12/chartex" xmlns:cx7="http://schemas.microsoft.com/office/drawing/2016/5/13/chartex" xmlns:cx8="http://schemas.microsoft.com/office/drawing/2016/5/14/chartex" xmlns:mc="http://schemas.openxmlformats.org/markup-compatibility/2006" xmlns:aink="http://schemas.microsoft.com/office/drawing/2016/ink" xmlns:am3d="http://schemas.microsoft.com/office/drawing/2017/model3d" xmlns:o="urn:schemas-microsoft-com:office:office" xmlns:oel="http://schemas.microsoft.com/office/2019/extlst" xmlns:r="http://schemas.openxmlformats.org/officeDocument/2006/relationships" xmlns:m="http://schemas.openxmlformats.org/officeDocument/2006/math" xmlns:v="urn:schemas-microsoft-com:vml" xmlns:wp14="http://schemas.microsoft.com/office/word/2010/wordprocessingDrawing" xmlns:wp="http://schemas.openxmlformats.org/drawingml/2006/wordprocessingDrawing" xmlns:w10="urn:schemas-microsoft-com:office:word" xmlns:w="http://schemas.openxmlformats.org/wordprocessingml/2006/main" xmlns:w14="http://schemas.microsoft.com/office/word/2010/wordml" xmlns:w15="http://schemas.microsoft.com/office/word/2012/wordml" xmlns:w16cex="http://schemas.microsoft.com/office/word/2018/wordml/cex" xmlns:w16cid="http://schemas.microsoft.com/office/word/2016/wordml/cid" xmlns:w16="http://schemas.microsoft.com/office/word/2018/wordml" xmlns:w16du="http://schemas.microsoft.com/office/word/2023/wordml/word16du" xmlns:w16sdtdh="http://schemas.microsoft.com/office/word/2020/wordml/sdtdatahash" xmlns:w16sdtfl="http://schemas.microsoft.com/office/word/2024/wordml/sdtformatlock" xmlns:w16se="http://schemas.microsoft.com/office/word/2015/wordml/symex" xmlns:wpg="http://schemas.microsoft.com/office/word/2010/wordprocessingGroup" xmlns:wpi="http://schemas.microsoft.com/office/word/2010/wordprocessingInk" xmlns:wne="http://schemas.microsoft.com/office/word/2006/wordml" xmlns:wps="http://schemas.microsoft.com/office/word/2010/wordprocessingShape" mc:Ignorable="w14 w15 w16se w16cid w16 w16cex w16sdtdh w16sdtfl w16du wp14">
-  <w:comment w:id="0" w:author="Mack, Jennifer (contr-i2o)" w:date="2025-10-01T13:31:00Z" w:initials="MJ">
-    <w:p>
-      <w:pPr>
-        <w:pStyle w:val="CommentText"/>
-      </w:pPr>
-      <w:r>
-        <w:rPr>
-          <w:rStyle w:val="CommentReference"/>
-        </w:rPr>
-        <w:annotationRef/>
-      </w:r>
-      <w:r>
-        <w:t xml:space="preserve">We just need to make sure this is consistent with Section 3.1 of the BAA. </w:t>
-      </w:r>
-    </w:p>
-  </w:comment>
-</w:comments>
-</file>
-
-<file path=word/commentsExtended.xml><?xml version="1.0" encoding="utf-8"?>
-<w15:commentsEx xmlns:wpc="http://schemas.microsoft.com/office/word/2010/wordprocessingCanvas" xmlns:cx="http://schemas.microsoft.com/office/drawing/2014/chartex" xmlns:cx1="http://schemas.microsoft.com/office/drawing/2015/9/8/chartex" xmlns:cx2="http://schemas.microsoft.com/office/drawing/2015/10/21/chartex" xmlns:cx3="http://schemas.microsoft.com/office/drawing/2016/5/9/chartex" xmlns:cx4="http://schemas.microsoft.com/office/drawing/2016/5/10/chartex" xmlns:cx5="http://schemas.microsoft.com/office/drawing/2016/5/11/chartex" xmlns:cx6="http://schemas.microsoft.com/office/drawing/2016/5/12/chartex" xmlns:cx7="http://schemas.microsoft.com/office/drawing/2016/5/13/chartex" xmlns:cx8="http://schemas.microsoft.com/office/drawing/2016/5/14/chartex" xmlns:mc="http://schemas.openxmlformats.org/markup-compatibility/2006" xmlns:aink="http://schemas.microsoft.com/office/drawing/2016/ink" xmlns:am3d="http://schemas.microsoft.com/office/drawing/2017/model3d" xmlns:o="urn:schemas-microsoft-com:office:office" xmlns:oel="http://schemas.microsoft.com/office/2019/extlst" xmlns:r="http://schemas.openxmlformats.org/officeDocument/2006/relationships" xmlns:m="http://schemas.openxmlformats.org/officeDocument/2006/math" xmlns:v="urn:schemas-microsoft-com:vml" xmlns:wp14="http://schemas.microsoft.com/office/word/2010/wordprocessingDrawing" xmlns:wp="http://schemas.openxmlformats.org/drawingml/2006/wordprocessingDrawing" xmlns:w10="urn:schemas-microsoft-com:office:word" xmlns:w="http://schemas.openxmlformats.org/wordprocessingml/2006/main" xmlns:w14="http://schemas.microsoft.com/office/word/2010/wordml" xmlns:w15="http://schemas.microsoft.com/office/word/2012/wordml" xmlns:w16cex="http://schemas.microsoft.com/office/word/2018/wordml/cex" xmlns:w16cid="http://schemas.microsoft.com/office/word/2016/wordml/cid" xmlns:w16="http://schemas.microsoft.com/office/word/2018/wordml" xmlns:w16du="http://schemas.microsoft.com/office/word/2023/wordml/word16du" xmlns:w16sdtdh="http://schemas.microsoft.com/office/word/2020/wordml/sdtdatahash" xmlns:w16sdtfl="http://schemas.microsoft.com/office/word/2024/wordml/sdtformatlock" xmlns:w16se="http://schemas.microsoft.com/office/word/2015/wordml/symex" xmlns:wpg="http://schemas.microsoft.com/office/word/2010/wordprocessingGroup" xmlns:wpi="http://schemas.microsoft.com/office/word/2010/wordprocessingInk" xmlns:wne="http://schemas.microsoft.com/office/word/2006/wordml" xmlns:wps="http://schemas.microsoft.com/office/word/2010/wordprocessingShape" mc:Ignorable="w14 w15 w16se w16cid w16 w16cex w16sdtdh w16sdtfl w16du wp14">
-  <w15:commentEx w15:paraId="263B5CF4" w15:done="1"/>
-</w15:commentsEx>
-</file>
-
-<file path=word/commentsExtensible.xml><?xml version="1.0" encoding="utf-8"?>
-<w16cex:commentsExtensible xmlns:wpc="http://schemas.microsoft.com/office/word/2010/wordprocessingCanvas" xmlns:cx="http://schemas.microsoft.com/office/drawing/2014/chartex" xmlns:cx1="http://schemas.microsoft.com/office/drawing/2015/9/8/chartex" xmlns:cx2="http://schemas.microsoft.com/office/drawing/2015/10/21/chartex" xmlns:cx3="http://schemas.microsoft.com/office/drawing/2016/5/9/chartex" xmlns:cx4="http://schemas.microsoft.com/office/drawing/2016/5/10/chartex" xmlns:cx5="http://schemas.microsoft.com/office/drawing/2016/5/11/chartex" xmlns:cx6="http://schemas.microsoft.com/office/drawing/2016/5/12/chartex" xmlns:cx7="http://schemas.microsoft.com/office/drawing/2016/5/13/chartex" xmlns:cx8="http://schemas.microsoft.com/office/drawing/2016/5/14/chartex" xmlns:cr="http://schemas.microsoft.com/office/comments/2020/reactions" xmlns:mc="http://schemas.openxmlformats.org/markup-compatibility/2006" xmlns:aink="http://schemas.microsoft.com/office/drawing/2016/ink" xmlns:am3d="http://schemas.microsoft.com/office/drawing/2017/model3d" xmlns:o="urn:schemas-microsoft-com:office:office" xmlns:oel="http://schemas.microsoft.com/office/2019/extlst" xmlns:r="http://schemas.openxmlformats.org/officeDocument/2006/relationships" xmlns:m="http://schemas.openxmlformats.org/officeDocument/2006/math" xmlns:v="urn:schemas-microsoft-com:vml" xmlns:wp14="http://schemas.microsoft.com/office/word/2010/wordprocessingDrawing" xmlns:wp="http://schemas.openxmlformats.org/drawingml/2006/wordprocessingDrawing" xmlns:w10="urn:schemas-microsoft-com:office:word" xmlns:w="http://schemas.openxmlformats.org/wordprocessingml/2006/main" xmlns:w14="http://schemas.microsoft.com/office/word/2010/wordml" xmlns:w15="http://schemas.microsoft.com/office/word/2012/wordml" xmlns:w16cex="http://schemas.microsoft.com/office/word/2018/wordml/cex" xmlns:w16cid="http://schemas.microsoft.com/office/word/2016/wordml/cid" xmlns:w16="http://schemas.microsoft.com/office/word/2018/wordml" xmlns:w16du="http://schemas.microsoft.com/office/word/2023/wordml/word16du" xmlns:w16sdtdh="http://schemas.microsoft.com/office/word/2020/wordml/sdtdatahash" xmlns:w16sdtfl="http://schemas.microsoft.com/office/word/2024/wordml/sdtformatlock" xmlns:w16se="http://schemas.microsoft.com/office/word/2015/wordml/symex" xmlns:wpg="http://schemas.microsoft.com/office/word/2010/wordprocessingGroup" xmlns:wpi="http://schemas.microsoft.com/office/word/2010/wordprocessingInk" xmlns:wne="http://schemas.microsoft.com/office/word/2006/wordml" xmlns:wps="http://schemas.microsoft.com/office/word/2010/wordprocessingShape" mc:Ignorable="w14 w15 w16se w16cid w16 w16cex w16sdtdh w16sdtfl cr w16du wp14">
-  <w16cex:commentExtensible w16cex:durableId="0B017C74" w16cex:dateUtc="2025-10-01T20:31:00Z"/>
-</w16cex:commentsExtensible>
-</file>
-
-<file path=word/commentsIds.xml><?xml version="1.0" encoding="utf-8"?>
-<w16cid:commentsIds xmlns:wpc="http://schemas.microsoft.com/office/word/2010/wordprocessingCanvas" xmlns:cx="http://schemas.microsoft.com/office/drawing/2014/chartex" xmlns:cx1="http://schemas.microsoft.com/office/drawing/2015/9/8/chartex" xmlns:cx2="http://schemas.microsoft.com/office/drawing/2015/10/21/chartex" xmlns:cx3="http://schemas.microsoft.com/office/drawing/2016/5/9/chartex" xmlns:cx4="http://schemas.microsoft.com/office/drawing/2016/5/10/chartex" xmlns:cx5="http://schemas.microsoft.com/office/drawing/2016/5/11/chartex" xmlns:cx6="http://schemas.microsoft.com/office/drawing/2016/5/12/chartex" xmlns:cx7="http://schemas.microsoft.com/office/drawing/2016/5/13/chartex" xmlns:cx8="http://schemas.microsoft.com/office/drawing/2016/5/14/chartex" xmlns:mc="http://schemas.openxmlformats.org/markup-compatibility/2006" xmlns:aink="http://schemas.microsoft.com/office/drawing/2016/ink" xmlns:am3d="http://schemas.microsoft.com/office/drawing/2017/model3d" xmlns:o="urn:schemas-microsoft-com:office:office" xmlns:oel="http://schemas.microsoft.com/office/2019/extlst" xmlns:r="http://schemas.openxmlformats.org/officeDocument/2006/relationships" xmlns:m="http://schemas.openxmlformats.org/officeDocument/2006/math" xmlns:v="urn:schemas-microsoft-com:vml" xmlns:wp14="http://schemas.microsoft.com/office/word/2010/wordprocessingDrawing" xmlns:wp="http://schemas.openxmlformats.org/drawingml/2006/wordprocessingDrawing" xmlns:w10="urn:schemas-microsoft-com:office:word" xmlns:w="http://schemas.openxmlformats.org/wordprocessingml/2006/main" xmlns:w14="http://schemas.microsoft.com/office/word/2010/wordml" xmlns:w15="http://schemas.microsoft.com/office/word/2012/wordml" xmlns:w16cex="http://schemas.microsoft.com/office/word/2018/wordml/cex" xmlns:w16cid="http://schemas.microsoft.com/office/word/2016/wordml/cid" xmlns:w16="http://schemas.microsoft.com/office/word/2018/wordml" xmlns:w16du="http://schemas.microsoft.com/office/word/2023/wordml/word16du" xmlns:w16sdtdh="http://schemas.microsoft.com/office/word/2020/wordml/sdtdatahash" xmlns:w16sdtfl="http://schemas.microsoft.com/office/word/2024/wordml/sdtformatlock" xmlns:w16se="http://schemas.microsoft.com/office/word/2015/wordml/symex" xmlns:wpg="http://schemas.microsoft.com/office/word/2010/wordprocessingGroup" xmlns:wpi="http://schemas.microsoft.com/office/word/2010/wordprocessingInk" xmlns:wne="http://schemas.microsoft.com/office/word/2006/wordml" xmlns:wps="http://schemas.microsoft.com/office/word/2010/wordprocessingShape" mc:Ignorable="w14 w15 w16se w16cid w16 w16cex w16sdtdh w16sdtfl w16du wp14">
-  <w16cid:commentId w16cid:paraId="263B5CF4" w16cid:durableId="0B017C74"/>
-</w16cid:commentsIds>
 </file>
 
 <file path=word/endnotes.xml><?xml version="1.0" encoding="utf-8"?>
@@ -4094,14 +4098,6 @@
     <w:abstractNumId w:val="11"/>
   </w:num>
 </w:numbering>
-</file>
-
-<file path=word/people.xml><?xml version="1.0" encoding="utf-8"?>
-<w15:people xmlns:wpc="http://schemas.microsoft.com/office/word/2010/wordprocessingCanvas" xmlns:cx="http://schemas.microsoft.com/office/drawing/2014/chartex" xmlns:cx1="http://schemas.microsoft.com/office/drawing/2015/9/8/chartex" xmlns:cx2="http://schemas.microsoft.com/office/drawing/2015/10/21/chartex" xmlns:cx3="http://schemas.microsoft.com/office/drawing/2016/5/9/chartex" xmlns:cx4="http://schemas.microsoft.com/office/drawing/2016/5/10/chartex" xmlns:cx5="http://schemas.microsoft.com/office/drawing/2016/5/11/chartex" xmlns:cx6="http://schemas.microsoft.com/office/drawing/2016/5/12/chartex" xmlns:cx7="http://schemas.microsoft.com/office/drawing/2016/5/13/chartex" xmlns:cx8="http://schemas.microsoft.com/office/drawing/2016/5/14/chartex" xmlns:mc="http://schemas.openxmlformats.org/markup-compatibility/2006" xmlns:aink="http://schemas.microsoft.com/office/drawing/2016/ink" xmlns:am3d="http://schemas.microsoft.com/office/drawing/2017/model3d" xmlns:o="urn:schemas-microsoft-com:office:office" xmlns:oel="http://schemas.microsoft.com/office/2019/extlst" xmlns:r="http://schemas.openxmlformats.org/officeDocument/2006/relationships" xmlns:m="http://schemas.openxmlformats.org/officeDocument/2006/math" xmlns:v="urn:schemas-microsoft-com:vml" xmlns:wp14="http://schemas.microsoft.com/office/word/2010/wordprocessingDrawing" xmlns:wp="http://schemas.openxmlformats.org/drawingml/2006/wordprocessingDrawing" xmlns:w10="urn:schemas-microsoft-com:office:word" xmlns:w="http://schemas.openxmlformats.org/wordprocessingml/2006/main" xmlns:w14="http://schemas.microsoft.com/office/word/2010/wordml" xmlns:w15="http://schemas.microsoft.com/office/word/2012/wordml" xmlns:w16cex="http://schemas.microsoft.com/office/word/2018/wordml/cex" xmlns:w16cid="http://schemas.microsoft.com/office/word/2016/wordml/cid" xmlns:w16="http://schemas.microsoft.com/office/word/2018/wordml" xmlns:w16du="http://schemas.microsoft.com/office/word/2023/wordml/word16du" xmlns:w16sdtdh="http://schemas.microsoft.com/office/word/2020/wordml/sdtdatahash" xmlns:w16sdtfl="http://schemas.microsoft.com/office/word/2024/wordml/sdtformatlock" xmlns:w16se="http://schemas.microsoft.com/office/word/2015/wordml/symex" xmlns:wpg="http://schemas.microsoft.com/office/word/2010/wordprocessingGroup" xmlns:wpi="http://schemas.microsoft.com/office/word/2010/wordprocessingInk" xmlns:wne="http://schemas.microsoft.com/office/word/2006/wordml" xmlns:wps="http://schemas.microsoft.com/office/word/2010/wordprocessingShape" mc:Ignorable="w14 w15 w16se w16cid w16 w16cex w16sdtdh w16sdtfl w16du wp14">
-  <w15:person w15:author="Mack, Jennifer (contr-i2o)">
-    <w15:presenceInfo w15:providerId="AD" w15:userId="S::jennifer.mack.ctr@darpa.mil::8096cfd0-c771-474c-aaf1-76e6468c9544"/>
-  </w15:person>
-</w15:people>
 </file>
 
 <file path=word/styles.xml><?xml version="1.0" encoding="utf-8"?>
@@ -4508,9 +4504,6 @@
     <w:rsid w:val="00367412"/>
     <w:pPr>
       <w:keepNext/>
-      <w:numPr>
-        <w:numId w:val="1"/>
-      </w:numPr>
       <w:spacing w:before="240" w:after="120"/>
       <w:outlineLvl w:val="0"/>
     </w:pPr>
@@ -5856,294 +5849,4 @@
   <a:objectDefaults/>
   <a:extraClrSchemeLst/>
 </a:theme>
-</file>
-
-<file path=customXml/item1.xml><?xml version="1.0" encoding="utf-8"?>
-<p:properties xmlns:p="http://schemas.microsoft.com/office/2006/metadata/properties" xmlns:xsi="http://www.w3.org/2001/XMLSchema-instance" xmlns:pc="http://schemas.microsoft.com/office/infopath/2007/PartnerControls">
-  <documentManagement>
-    <TaxCatchAll xmlns="9c305744-0039-47fe-a0e0-ab796fc728ea" xsi:nil="true"/>
-    <lcf76f155ced4ddcb4097134ff3c332f xmlns="0ae3abbb-c905-4f0e-abd0-b2a766502642">
-      <Terms xmlns="http://schemas.microsoft.com/office/infopath/2007/PartnerControls"/>
-    </lcf76f155ced4ddcb4097134ff3c332f>
-    <Order0 xmlns="0ae3abbb-c905-4f0e-abd0-b2a766502642" xsi:nil="true"/>
-  </documentManagement>
-</p:properties>
-</file>
-
-<file path=customXml/item2.xml><?xml version="1.0" encoding="utf-8"?>
-<b:Sources xmlns:b="http://schemas.openxmlformats.org/officeDocument/2006/bibliography" xmlns="http://schemas.openxmlformats.org/officeDocument/2006/bibliography" SelectedStyle="\APASixthEditionOfficeOnline.xsl" StyleName="APA" Version="6"/>
-</file>
-
-<file path=customXml/item3.xml><?xml version="1.0" encoding="utf-8"?>
-<?mso-contentType ?>
-<FormTemplates xmlns="http://schemas.microsoft.com/sharepoint/v3/contenttype/forms">
-  <Display>DocumentLibraryForm</Display>
-  <Edit>DocumentLibraryForm</Edit>
-  <New>DocumentLibraryForm</New>
-</FormTemplates>
-</file>
-
-<file path=customXml/item4.xml><?xml version="1.0" encoding="utf-8"?>
-<ct:contentTypeSchema xmlns:ct="http://schemas.microsoft.com/office/2006/metadata/contentType" xmlns:ma="http://schemas.microsoft.com/office/2006/metadata/properties/metaAttributes" ct:_="" ma:_="" ma:contentTypeName="Document" ma:contentTypeID="0x010100BB81731B9B73D940A01C2EF1AE001404" ma:contentTypeVersion="16" ma:contentTypeDescription="Create a new document." ma:contentTypeScope="" ma:versionID="75d544a554fcc574b8722c385723a616">
-  <xsd:schema xmlns:xsd="http://www.w3.org/2001/XMLSchema" xmlns:xs="http://www.w3.org/2001/XMLSchema" xmlns:p="http://schemas.microsoft.com/office/2006/metadata/properties" xmlns:ns2="0ae3abbb-c905-4f0e-abd0-b2a766502642" xmlns:ns3="9c305744-0039-47fe-a0e0-ab796fc728ea" targetNamespace="http://schemas.microsoft.com/office/2006/metadata/properties" ma:root="true" ma:fieldsID="1aca7a5294d6f838d0a61394a33d7835" ns2:_="" ns3:_="">
-    <xsd:import namespace="0ae3abbb-c905-4f0e-abd0-b2a766502642"/>
-    <xsd:import namespace="9c305744-0039-47fe-a0e0-ab796fc728ea"/>
-    <xsd:element name="properties">
-      <xsd:complexType>
-        <xsd:sequence>
-          <xsd:element name="documentManagement">
-            <xsd:complexType>
-              <xsd:all>
-                <xsd:element ref="ns2:Order0" minOccurs="0"/>
-                <xsd:element ref="ns2:MediaServiceMetadata" minOccurs="0"/>
-                <xsd:element ref="ns2:MediaServiceFastMetadata" minOccurs="0"/>
-                <xsd:element ref="ns2:MediaServiceSearchProperties" minOccurs="0"/>
-                <xsd:element ref="ns2:MediaServiceDateTaken" minOccurs="0"/>
-                <xsd:element ref="ns2:MediaServiceGenerationTime" minOccurs="0"/>
-                <xsd:element ref="ns2:MediaServiceEventHashCode" minOccurs="0"/>
-                <xsd:element ref="ns2:MediaLengthInSeconds" minOccurs="0"/>
-                <xsd:element ref="ns2:MediaServiceOCR" minOccurs="0"/>
-                <xsd:element ref="ns2:lcf76f155ced4ddcb4097134ff3c332f" minOccurs="0"/>
-                <xsd:element ref="ns3:TaxCatchAll" minOccurs="0"/>
-                <xsd:element ref="ns2:MediaServiceBillingMetadata" minOccurs="0"/>
-                <xsd:element ref="ns2:MediaServiceLocation" minOccurs="0"/>
-              </xsd:all>
-            </xsd:complexType>
-          </xsd:element>
-        </xsd:sequence>
-      </xsd:complexType>
-    </xsd:element>
-  </xsd:schema>
-  <xsd:schema xmlns:xsd="http://www.w3.org/2001/XMLSchema" xmlns:xs="http://www.w3.org/2001/XMLSchema" xmlns:dms="http://schemas.microsoft.com/office/2006/documentManagement/types" xmlns:pc="http://schemas.microsoft.com/office/infopath/2007/PartnerControls" targetNamespace="0ae3abbb-c905-4f0e-abd0-b2a766502642" elementFormDefault="qualified">
-    <xsd:import namespace="http://schemas.microsoft.com/office/2006/documentManagement/types"/>
-    <xsd:import namespace="http://schemas.microsoft.com/office/infopath/2007/PartnerControls"/>
-    <xsd:element name="Order0" ma:index="5" nillable="true" ma:displayName="Order" ma:internalName="Order0" ma:readOnly="false" ma:percentage="FALSE">
-      <xsd:simpleType>
-        <xsd:restriction base="dms:Number"/>
-      </xsd:simpleType>
-    </xsd:element>
-    <xsd:element name="MediaServiceMetadata" ma:index="9" nillable="true" ma:displayName="MediaServiceMetadata" ma:hidden="true" ma:internalName="MediaServiceMetadata" ma:readOnly="true">
-      <xsd:simpleType>
-        <xsd:restriction base="dms:Note"/>
-      </xsd:simpleType>
-    </xsd:element>
-    <xsd:element name="MediaServiceFastMetadata" ma:index="10" nillable="true" ma:displayName="MediaServiceFastMetadata" ma:hidden="true" ma:internalName="MediaServiceFastMetadata" ma:readOnly="true">
-      <xsd:simpleType>
-        <xsd:restriction base="dms:Note"/>
-      </xsd:simpleType>
-    </xsd:element>
-    <xsd:element name="MediaServiceSearchProperties" ma:index="11" nillable="true" ma:displayName="MediaServiceSearchProperties" ma:hidden="true" ma:internalName="MediaServiceSearchProperties" ma:readOnly="true">
-      <xsd:simpleType>
-        <xsd:restriction base="dms:Note"/>
-      </xsd:simpleType>
-    </xsd:element>
-    <xsd:element name="MediaServiceDateTaken" ma:index="12" nillable="true" ma:displayName="MediaServiceDateTaken" ma:hidden="true" ma:indexed="true" ma:internalName="MediaServiceDateTaken" ma:readOnly="true">
-      <xsd:simpleType>
-        <xsd:restriction base="dms:Text"/>
-      </xsd:simpleType>
-    </xsd:element>
-    <xsd:element name="MediaServiceGenerationTime" ma:index="13" nillable="true" ma:displayName="MediaServiceGenerationTime" ma:hidden="true" ma:internalName="MediaServiceGenerationTime" ma:readOnly="true">
-      <xsd:simpleType>
-        <xsd:restriction base="dms:Text"/>
-      </xsd:simpleType>
-    </xsd:element>
-    <xsd:element name="MediaServiceEventHashCode" ma:index="14" nillable="true" ma:displayName="MediaServiceEventHashCode" ma:hidden="true" ma:internalName="MediaServiceEventHashCode" ma:readOnly="true">
-      <xsd:simpleType>
-        <xsd:restriction base="dms:Text"/>
-      </xsd:simpleType>
-    </xsd:element>
-    <xsd:element name="MediaLengthInSeconds" ma:index="15" nillable="true" ma:displayName="MediaLengthInSeconds" ma:hidden="true" ma:internalName="MediaLengthInSeconds" ma:readOnly="true">
-      <xsd:simpleType>
-        <xsd:restriction base="dms:Unknown"/>
-      </xsd:simpleType>
-    </xsd:element>
-    <xsd:element name="MediaServiceOCR" ma:index="16" nillable="true" ma:displayName="Extracted Text" ma:internalName="MediaServiceOCR" ma:readOnly="true">
-      <xsd:simpleType>
-        <xsd:restriction base="dms:Note">
-          <xsd:maxLength value="255"/>
-        </xsd:restriction>
-      </xsd:simpleType>
-    </xsd:element>
-    <xsd:element name="lcf76f155ced4ddcb4097134ff3c332f" ma:index="18" nillable="true" ma:taxonomy="true" ma:internalName="lcf76f155ced4ddcb4097134ff3c332f" ma:taxonomyFieldName="MediaServiceImageTags" ma:displayName="Image Tags" ma:fieldId="{5cf76f15-5ced-4ddc-b409-7134ff3c332f}" ma:taxonomyMulti="true" ma:sspId="00000000-0000-0000-0000-000000000000" ma:termSetId="00000000-0000-0000-0000-000000000000" ma:anchorId="00000000-0000-0000-0000-000000000000" ma:open="false" ma:isKeyword="false">
-      <xsd:complexType>
-        <xsd:sequence>
-          <xsd:element ref="pc:Terms" minOccurs="0" maxOccurs="1"/>
-        </xsd:sequence>
-      </xsd:complexType>
-    </xsd:element>
-    <xsd:element name="MediaServiceBillingMetadata" ma:index="20" nillable="true" ma:displayName="MediaServiceBillingMetadata" ma:hidden="true" ma:internalName="MediaServiceBillingMetadata" ma:readOnly="true">
-      <xsd:simpleType>
-        <xsd:restriction base="dms:Note"/>
-      </xsd:simpleType>
-    </xsd:element>
-    <xsd:element name="MediaServiceLocation" ma:index="21" nillable="true" ma:displayName="Location" ma:description="" ma:indexed="true" ma:internalName="MediaServiceLocation" ma:readOnly="true">
-      <xsd:simpleType>
-        <xsd:restriction base="dms:Text"/>
-      </xsd:simpleType>
-    </xsd:element>
-  </xsd:schema>
-  <xsd:schema xmlns:xsd="http://www.w3.org/2001/XMLSchema" xmlns:xs="http://www.w3.org/2001/XMLSchema" xmlns:dms="http://schemas.microsoft.com/office/2006/documentManagement/types" xmlns:pc="http://schemas.microsoft.com/office/infopath/2007/PartnerControls" targetNamespace="9c305744-0039-47fe-a0e0-ab796fc728ea" elementFormDefault="qualified">
-    <xsd:import namespace="http://schemas.microsoft.com/office/2006/documentManagement/types"/>
-    <xsd:import namespace="http://schemas.microsoft.com/office/infopath/2007/PartnerControls"/>
-    <xsd:element name="TaxCatchAll" ma:index="19" nillable="true" ma:displayName="Taxonomy Catch All Column" ma:hidden="true" ma:list="{d05fd1c8-9035-4c2f-9035-97143bc958d7}" ma:internalName="TaxCatchAll" ma:showField="CatchAllData" ma:web="9c305744-0039-47fe-a0e0-ab796fc728ea">
-      <xsd:complexType>
-        <xsd:complexContent>
-          <xsd:extension base="dms:MultiChoiceLookup">
-            <xsd:sequence>
-              <xsd:element name="Value" type="dms:Lookup" maxOccurs="unbounded" minOccurs="0" nillable="true"/>
-            </xsd:sequence>
-          </xsd:extension>
-        </xsd:complexContent>
-      </xsd:complexType>
-    </xsd:element>
-  </xsd:schema>
-  <xsd:schema xmlns="http://schemas.openxmlformats.org/package/2006/metadata/core-properties" xmlns:xsd="http://www.w3.org/2001/XMLSchema" xmlns:xsi="http://www.w3.org/2001/XMLSchema-instance" xmlns:dc="http://purl.org/dc/elements/1.1/" xmlns:dcterms="http://purl.org/dc/terms/" xmlns:odoc="http://schemas.microsoft.com/internal/obd" targetNamespace="http://schemas.openxmlformats.org/package/2006/metadata/core-properties" elementFormDefault="qualified" attributeFormDefault="unqualified" blockDefault="#all">
-    <xsd:import namespace="http://purl.org/dc/elements/1.1/" schemaLocation="http://dublincore.org/schemas/xmls/qdc/2003/04/02/dc.xsd"/>
-    <xsd:import namespace="http://purl.org/dc/terms/" schemaLocation="http://dublincore.org/schemas/xmls/qdc/2003/04/02/dcterms.xsd"/>
-    <xsd:element name="coreProperties" type="CT_coreProperties"/>
-    <xsd:complexType name="CT_coreProperties">
-      <xsd:all>
-        <xsd:element ref="dc:creator" minOccurs="0" maxOccurs="1"/>
-        <xsd:element ref="dcterms:created" minOccurs="0" maxOccurs="1"/>
-        <xsd:element ref="dc:identifier" minOccurs="0" maxOccurs="1"/>
-        <xsd:element name="contentType" minOccurs="0" maxOccurs="1" type="xsd:string" ma:index="6" ma:displayName="Content Type"/>
-        <xsd:element ref="dc:title" minOccurs="0" maxOccurs="1" ma:index="3" ma:displayName="Title"/>
-        <xsd:element ref="dc:subject" minOccurs="0" maxOccurs="1"/>
-        <xsd:element ref="dc:description" minOccurs="0" maxOccurs="1"/>
-        <xsd:element name="keywords" minOccurs="0" maxOccurs="1" type="xsd:string"/>
-        <xsd:element ref="dc:language" minOccurs="0" maxOccurs="1"/>
-        <xsd:element name="category" minOccurs="0" maxOccurs="1" type="xsd:string"/>
-        <xsd:element name="version" minOccurs="0" maxOccurs="1" type="xsd:string"/>
-        <xsd:element name="revision" minOccurs="0" maxOccurs="1" type="xsd:string">
-          <xsd:annotation>
-            <xsd:documentation>
-                        This value indicates the number of saves or revisions. The application is responsible for updating this value after each revision.
-                    </xsd:documentation>
-          </xsd:annotation>
-        </xsd:element>
-        <xsd:element name="lastModifiedBy" minOccurs="0" maxOccurs="1" type="xsd:string"/>
-        <xsd:element ref="dcterms:modified" minOccurs="0" maxOccurs="1"/>
-        <xsd:element name="contentStatus" minOccurs="0" maxOccurs="1" type="xsd:string"/>
-      </xsd:all>
-    </xsd:complexType>
-  </xsd:schema>
-  <xs:schema xmlns:pc="http://schemas.microsoft.com/office/infopath/2007/PartnerControls" xmlns:xs="http://www.w3.org/2001/XMLSchema" targetNamespace="http://schemas.microsoft.com/office/infopath/2007/PartnerControls" elementFormDefault="qualified" attributeFormDefault="unqualified">
-    <xs:element name="Person">
-      <xs:complexType>
-        <xs:sequence>
-          <xs:element ref="pc:DisplayName" minOccurs="0"/>
-          <xs:element ref="pc:AccountId" minOccurs="0"/>
-          <xs:element ref="pc:AccountType" minOccurs="0"/>
-        </xs:sequence>
-      </xs:complexType>
-    </xs:element>
-    <xs:element name="DisplayName" type="xs:string"/>
-    <xs:element name="AccountId" type="xs:string"/>
-    <xs:element name="AccountType" type="xs:string"/>
-    <xs:element name="BDCAssociatedEntity">
-      <xs:complexType>
-        <xs:sequence>
-          <xs:element ref="pc:BDCEntity" minOccurs="0" maxOccurs="unbounded"/>
-        </xs:sequence>
-        <xs:attribute ref="pc:EntityNamespace"/>
-        <xs:attribute ref="pc:EntityName"/>
-        <xs:attribute ref="pc:SystemInstanceName"/>
-        <xs:attribute ref="pc:AssociationName"/>
-      </xs:complexType>
-    </xs:element>
-    <xs:attribute name="EntityNamespace" type="xs:string"/>
-    <xs:attribute name="EntityName" type="xs:string"/>
-    <xs:attribute name="SystemInstanceName" type="xs:string"/>
-    <xs:attribute name="AssociationName" type="xs:string"/>
-    <xs:element name="BDCEntity">
-      <xs:complexType>
-        <xs:sequence>
-          <xs:element ref="pc:EntityDisplayName" minOccurs="0"/>
-          <xs:element ref="pc:EntityInstanceReference" minOccurs="0"/>
-          <xs:element ref="pc:EntityId1" minOccurs="0"/>
-          <xs:element ref="pc:EntityId2" minOccurs="0"/>
-          <xs:element ref="pc:EntityId3" minOccurs="0"/>
-          <xs:element ref="pc:EntityId4" minOccurs="0"/>
-          <xs:element ref="pc:EntityId5" minOccurs="0"/>
-        </xs:sequence>
-      </xs:complexType>
-    </xs:element>
-    <xs:element name="EntityDisplayName" type="xs:string"/>
-    <xs:element name="EntityInstanceReference" type="xs:string"/>
-    <xs:element name="EntityId1" type="xs:string"/>
-    <xs:element name="EntityId2" type="xs:string"/>
-    <xs:element name="EntityId3" type="xs:string"/>
-    <xs:element name="EntityId4" type="xs:string"/>
-    <xs:element name="EntityId5" type="xs:string"/>
-    <xs:element name="Terms">
-      <xs:complexType>
-        <xs:sequence>
-          <xs:element ref="pc:TermInfo" minOccurs="0" maxOccurs="unbounded"/>
-        </xs:sequence>
-      </xs:complexType>
-    </xs:element>
-    <xs:element name="TermInfo">
-      <xs:complexType>
-        <xs:sequence>
-          <xs:element ref="pc:TermName" minOccurs="0"/>
-          <xs:element ref="pc:TermId" minOccurs="0"/>
-        </xs:sequence>
-      </xs:complexType>
-    </xs:element>
-    <xs:element name="TermName" type="xs:string"/>
-    <xs:element name="TermId" type="xs:string"/>
-  </xs:schema>
-</ct:contentTypeSchema>
-</file>
-
-<file path=customXml/itemProps1.xml><?xml version="1.0" encoding="utf-8"?>
-<ds:datastoreItem xmlns:ds="http://schemas.openxmlformats.org/officeDocument/2006/customXml" ds:itemID="{DCFE53FA-E805-4289-BB3C-66EA63FB99E4}">
-  <ds:schemaRefs>
-    <ds:schemaRef ds:uri="http://schemas.microsoft.com/office/2006/metadata/properties"/>
-    <ds:schemaRef ds:uri="http://schemas.microsoft.com/office/infopath/2007/PartnerControls"/>
-    <ds:schemaRef ds:uri="9c305744-0039-47fe-a0e0-ab796fc728ea"/>
-    <ds:schemaRef ds:uri="0ae3abbb-c905-4f0e-abd0-b2a766502642"/>
-  </ds:schemaRefs>
-</ds:datastoreItem>
-</file>
-
-<file path=customXml/itemProps2.xml><?xml version="1.0" encoding="utf-8"?>
-<ds:datastoreItem xmlns:ds="http://schemas.openxmlformats.org/officeDocument/2006/customXml" ds:itemID="{D3FF3DCC-A825-45C4-BF70-5325015A98F1}">
-  <ds:schemaRefs>
-    <ds:schemaRef ds:uri="http://schemas.openxmlformats.org/officeDocument/2006/bibliography"/>
-  </ds:schemaRefs>
-</ds:datastoreItem>
-</file>
-
-<file path=customXml/itemProps3.xml><?xml version="1.0" encoding="utf-8"?>
-<ds:datastoreItem xmlns:ds="http://schemas.openxmlformats.org/officeDocument/2006/customXml" ds:itemID="{FAEA97C2-6638-4DF8-B4BC-A22A45DD7A64}">
-  <ds:schemaRefs>
-    <ds:schemaRef ds:uri="http://schemas.microsoft.com/sharepoint/v3/contenttype/forms"/>
-  </ds:schemaRefs>
-</ds:datastoreItem>
-</file>
-
-<file path=customXml/itemProps4.xml><?xml version="1.0" encoding="utf-8"?>
-<ds:datastoreItem xmlns:ds="http://schemas.openxmlformats.org/officeDocument/2006/customXml" ds:itemID="{FB91CB58-D827-41B4-9E57-7D699EA1E961}">
-  <ds:schemaRefs>
-    <ds:schemaRef ds:uri="http://schemas.microsoft.com/office/2006/metadata/contentType"/>
-    <ds:schemaRef ds:uri="http://schemas.microsoft.com/office/2006/metadata/properties/metaAttributes"/>
-    <ds:schemaRef ds:uri="http://www.w3.org/2001/XMLSchema"/>
-    <ds:schemaRef ds:uri="http://schemas.microsoft.com/office/2006/metadata/properties"/>
-    <ds:schemaRef ds:uri="0ae3abbb-c905-4f0e-abd0-b2a766502642"/>
-    <ds:schemaRef ds:uri="9c305744-0039-47fe-a0e0-ab796fc728ea"/>
-    <ds:schemaRef ds:uri="http://schemas.microsoft.com/office/2006/documentManagement/types"/>
-    <ds:schemaRef ds:uri="http://schemas.microsoft.com/office/infopath/2007/PartnerControls"/>
-    <ds:schemaRef ds:uri="http://schemas.openxmlformats.org/package/2006/metadata/core-properties"/>
-    <ds:schemaRef ds:uri="http://purl.org/dc/elements/1.1/"/>
-    <ds:schemaRef ds:uri="http://purl.org/dc/terms/"/>
-    <ds:schemaRef ds:uri="http://schemas.microsoft.com/internal/obd"/>
-  </ds:schemaRefs>
-</ds:datastoreItem>
-</file>
-
-<file path=docMetadata/LabelInfo.xml><?xml version="1.0" encoding="utf-8"?>
-<clbl:labelList xmlns:clbl="http://schemas.microsoft.com/office/2020/mipLabelMetadata">
-  <clbl:label id="{af82e219-c734-43c1-b6a6-17b40be899ef}" enabled="1" method="Privileged" siteId="{f84814b5-f44e-4690-9314-553e36b5f585}" removed="0"/>
-</clbl:labelList>
 </file>
</xml_diff>